<commit_message>
Document ExportWithoutFullParents and show it in the example settings
- Instructions.docx: new ExportWithoutFullParents bullet under
  EntitySettings, after Fields.
- ClientSettingsExample: the Item entity sets ExportWithoutFullParents,
  so Items without a Product are exported with only their own fields.

Co-Authored-By: Claude Opus 5.5 <noreply@anthropic.com>
</commit_message>
<xml_diff>
--- a/doc/Instructions.docx
+++ b/doc/Instructions.docx
@@ -592,6 +592,19 @@
       </w:pPr>
       <w:r>
         <w:t>Fields – list of field settings that will define which fields are going to be exported and rules how to export some complex fields (e.g. sku level field). If null or empty list, all fields will be exported.</w:t>
+      </w:r>
+    </w:p>
+    <w:p>
+      <w:pPr>
+        <w:pStyle w:val="ListParagraph"/>
+        <w:numPr>
+          <w:ilvl w:val="0"/>
+          <w:numId w:val="2"/>
+        </w:numPr>
+        <w:jc w:val="both"/>
+      </w:pPr>
+      <w:r>
+        <w:t>ExportWithoutFullParents – Boolean, false by default. An entity with a Full parents merge is only exported through its parent, so it is skipped when it has no parent. Set to true to export it on its own instead, without the parent’s fields (e.g. an Item without a Product). The full export picks these entities up in a last pass, unless SkipInFullExport is set for the entity.</w:t>
       </w:r>
     </w:p>
     <w:p>

</xml_diff>